<commit_message>
Étoffe le chapitre 7 - Engagements de France Décoration
Chaque sous-partie (7.1 à 7.6) passe d'un simple renvoi aux autres
chapitres à un développement autonome et chiffré : jalons/échéances pour
les délais, tableau exigences hospitalières/engagement, dispositif de
contrôle qualité avec fréquences, SLA de réactivité (24h/48h) par type de
sollicitation, effectifs par phase avec mécanisme de continuité, et
tableau des engagements environnementaux avec mode de vérification.
Ajoute un encart "Engagement France Décoration" synthétique et chiffré à
la fin de chaque sous-partie.

Co-Authored-By: Claude Sonnet 5 <noreply@anthropic.com>
Claude-Session: https://claude.ai/code/session_016J8ZBxzUkBqS3C16QP9P63
</commit_message>
<xml_diff>
--- a/livrables/Lot3_Chapitre7_Engagements.docx
+++ b/livrables/Lot3_Chapitre7_Engagements.docx
@@ -79,7 +79,7 @@
           <w:i w:val="0"/>
           <w:sz w:val="21"/>
         </w:rPr>
-        <w:t>En synthèse des chapitres précédents, France Décoration formalise ci-dessous les six engagements fermes pris pour la réalisation du Lot 3 de l'opération de création du nouveau scanner de l'hôpital René Muret. Ces engagements reprennent, sous forme chiffrée et vérifiable, les dispositions détaillées dans le corps du présent mémoire technique.</w:t>
+        <w:t>France Décoration formalise dans le présent chapitre six engagements fermes, chiffrés et vérifiables, pris pour la réalisation du Lot 3 de l'opération de création du nouveau scanner de l'hôpital René Muret. Chaque engagement est assorti d'indicateurs de suivi, d'un mode de preuve et, le cas échéant, d'un délai de réaction garanti, permettant à l'AP-HP et à la Maîtrise d'Œuvre d'en vérifier la tenue tout au long du chantier.</w:t>
       </w:r>
     </w:p>
     <w:p>
@@ -102,7 +102,346 @@
           <w:i w:val="0"/>
           <w:sz w:val="21"/>
         </w:rPr>
-        <w:t>France Décoration s'engage à réaliser l'ensemble des prestations du Lot 3 dans le délai contractuel de 45 jours calendaires, selon le planning détaillé au chapitre 5, structuré en une semaine de préparation (Mois 1 - S4), trois semaines de production (Mois 4 - S1 à S3) et une semaine de clôture (Mois 5 - S4), avec une marge de sécurité de quatre semaines intégrée avant réception.</w:t>
+        <w:t>France Décoration s'engage à réaliser l'intégralité des prestations du Lot 3 dans le délai contractuel de 45 jours calendaires, selon le planning détaillé au chapitre 5, sans recours à une prolongation de délai imputable à notre organisation.</w:t>
+      </w:r>
+    </w:p>
+    <w:tbl>
+      <w:tblPr>
+        <w:tblStyle w:val="TableGrid"/>
+        <w:tblW w:type="auto" w:w="0"/>
+        <w:jc w:val="center"/>
+        <w:tblLook w:firstColumn="1" w:firstRow="1" w:lastColumn="0" w:lastRow="0" w:noHBand="0" w:noVBand="1" w:val="04A0"/>
+      </w:tblPr>
+      <w:tblGrid>
+        <w:gridCol w:w="3400"/>
+        <w:gridCol w:w="3400"/>
+        <w:gridCol w:w="3400"/>
+      </w:tblGrid>
+      <w:tr>
+        <w:tc>
+          <w:tcPr>
+            <w:tcW w:type="dxa" w:w="3402"/>
+            <w:shd w:val="clear" w:color="auto" w:fill="2E74B5"/>
+          </w:tcPr>
+          <w:p>
+            <w:r/>
+            <w:r>
+              <w:rPr>
+                <w:b/>
+                <w:color w:val="FFFFFF"/>
+                <w:sz w:val="18"/>
+              </w:rPr>
+              <w:t>Jalon</w:t>
+            </w:r>
+          </w:p>
+        </w:tc>
+        <w:tc>
+          <w:tcPr>
+            <w:tcW w:type="dxa" w:w="1984"/>
+            <w:shd w:val="clear" w:color="auto" w:fill="2E74B5"/>
+          </w:tcPr>
+          <w:p>
+            <w:r/>
+            <w:r>
+              <w:rPr>
+                <w:b/>
+                <w:color w:val="FFFFFF"/>
+                <w:sz w:val="18"/>
+              </w:rPr>
+              <w:t>Échéance planning</w:t>
+            </w:r>
+          </w:p>
+        </w:tc>
+        <w:tc>
+          <w:tcPr>
+            <w:tcW w:type="dxa" w:w="3118"/>
+            <w:shd w:val="clear" w:color="auto" w:fill="2E74B5"/>
+          </w:tcPr>
+          <w:p>
+            <w:r/>
+            <w:r>
+              <w:rPr>
+                <w:b/>
+                <w:color w:val="FFFFFF"/>
+                <w:sz w:val="18"/>
+              </w:rPr>
+              <w:t>Engagement</w:t>
+            </w:r>
+          </w:p>
+        </w:tc>
+      </w:tr>
+      <w:tr>
+        <w:tc>
+          <w:tcPr>
+            <w:tcW w:type="dxa" w:w="3402"/>
+          </w:tcPr>
+          <w:p>
+            <w:r/>
+            <w:r>
+              <w:rPr>
+                <w:sz w:val="18"/>
+              </w:rPr>
+              <w:t>Notification du marché → remise des documents de préparation</w:t>
+            </w:r>
+          </w:p>
+        </w:tc>
+        <w:tc>
+          <w:tcPr>
+            <w:tcW w:type="dxa" w:w="1984"/>
+          </w:tcPr>
+          <w:p>
+            <w:r/>
+            <w:r>
+              <w:rPr>
+                <w:sz w:val="18"/>
+              </w:rPr>
+              <w:t>Mois 1 - S4 (1 semaine)</w:t>
+            </w:r>
+          </w:p>
+        </w:tc>
+        <w:tc>
+          <w:tcPr>
+            <w:tcW w:type="dxa" w:w="3118"/>
+          </w:tcPr>
+          <w:p>
+            <w:r/>
+            <w:r>
+              <w:rPr>
+                <w:sz w:val="18"/>
+              </w:rPr>
+              <w:t>PPSPS, PAQ et plans d'exécution remis avant ouverture de la fenêtre d'intervention</w:t>
+            </w:r>
+          </w:p>
+        </w:tc>
+      </w:tr>
+      <w:tr>
+        <w:tc>
+          <w:tcPr>
+            <w:tcW w:type="dxa" w:w="3402"/>
+          </w:tcPr>
+          <w:p>
+            <w:r/>
+            <w:r>
+              <w:rPr>
+                <w:sz w:val="18"/>
+              </w:rPr>
+              <w:t>Démarrage des travaux de faux plafonds</w:t>
+            </w:r>
+          </w:p>
+        </w:tc>
+        <w:tc>
+          <w:tcPr>
+            <w:tcW w:type="dxa" w:w="1984"/>
+          </w:tcPr>
+          <w:p>
+            <w:r/>
+            <w:r>
+              <w:rPr>
+                <w:sz w:val="18"/>
+              </w:rPr>
+              <w:t>Mois 4 - S1</w:t>
+            </w:r>
+          </w:p>
+        </w:tc>
+        <w:tc>
+          <w:tcPr>
+            <w:tcW w:type="dxa" w:w="3118"/>
+          </w:tcPr>
+          <w:p>
+            <w:r/>
+            <w:r>
+              <w:rPr>
+                <w:sz w:val="18"/>
+              </w:rPr>
+              <w:t>Démarrage sans délai dès mise à disposition des supports par les lots amont</w:t>
+            </w:r>
+          </w:p>
+        </w:tc>
+      </w:tr>
+      <w:tr>
+        <w:tc>
+          <w:tcPr>
+            <w:tcW w:type="dxa" w:w="3402"/>
+          </w:tcPr>
+          <w:p>
+            <w:r/>
+            <w:r>
+              <w:rPr>
+                <w:sz w:val="18"/>
+              </w:rPr>
+              <w:t>Achèvement des travaux de peinture</w:t>
+            </w:r>
+          </w:p>
+        </w:tc>
+        <w:tc>
+          <w:tcPr>
+            <w:tcW w:type="dxa" w:w="1984"/>
+          </w:tcPr>
+          <w:p>
+            <w:r/>
+            <w:r>
+              <w:rPr>
+                <w:sz w:val="18"/>
+              </w:rPr>
+              <w:t>Fin Mois 4 - S2</w:t>
+            </w:r>
+          </w:p>
+        </w:tc>
+        <w:tc>
+          <w:tcPr>
+            <w:tcW w:type="dxa" w:w="3118"/>
+          </w:tcPr>
+          <w:p>
+            <w:r/>
+            <w:r>
+              <w:rPr>
+                <w:sz w:val="18"/>
+              </w:rPr>
+              <w:t>Aucun report sur la phase sols souples</w:t>
+            </w:r>
+          </w:p>
+        </w:tc>
+      </w:tr>
+      <w:tr>
+        <w:tc>
+          <w:tcPr>
+            <w:tcW w:type="dxa" w:w="3402"/>
+          </w:tcPr>
+          <w:p>
+            <w:r/>
+            <w:r>
+              <w:rPr>
+                <w:sz w:val="18"/>
+              </w:rPr>
+              <w:t>Achèvement des travaux de sols souples</w:t>
+            </w:r>
+          </w:p>
+        </w:tc>
+        <w:tc>
+          <w:tcPr>
+            <w:tcW w:type="dxa" w:w="1984"/>
+          </w:tcPr>
+          <w:p>
+            <w:r/>
+            <w:r>
+              <w:rPr>
+                <w:sz w:val="18"/>
+              </w:rPr>
+              <w:t>Fin Mois 4 - S3</w:t>
+            </w:r>
+          </w:p>
+        </w:tc>
+        <w:tc>
+          <w:tcPr>
+            <w:tcW w:type="dxa" w:w="3118"/>
+          </w:tcPr>
+          <w:p>
+            <w:r/>
+            <w:r>
+              <w:rPr>
+                <w:sz w:val="18"/>
+              </w:rPr>
+              <w:t>Libération des zones pour la marge de sécurité</w:t>
+            </w:r>
+          </w:p>
+        </w:tc>
+      </w:tr>
+      <w:tr>
+        <w:tc>
+          <w:tcPr>
+            <w:tcW w:type="dxa" w:w="3402"/>
+          </w:tcPr>
+          <w:p>
+            <w:r/>
+            <w:r>
+              <w:rPr>
+                <w:sz w:val="18"/>
+              </w:rPr>
+              <w:t>Opérations Préalables à la Réception</w:t>
+            </w:r>
+          </w:p>
+        </w:tc>
+        <w:tc>
+          <w:tcPr>
+            <w:tcW w:type="dxa" w:w="1984"/>
+          </w:tcPr>
+          <w:p>
+            <w:r/>
+            <w:r>
+              <w:rPr>
+                <w:sz w:val="18"/>
+              </w:rPr>
+              <w:t>Mois 5 - S4 (Jour 2)</w:t>
+            </w:r>
+          </w:p>
+        </w:tc>
+        <w:tc>
+          <w:tcPr>
+            <w:tcW w:type="dxa" w:w="3118"/>
+          </w:tcPr>
+          <w:p>
+            <w:r/>
+            <w:r>
+              <w:rPr>
+                <w:sz w:val="18"/>
+              </w:rPr>
+              <w:t>Organisées sans report, sur la base des autocontrôles continus (cf. chapitre 2, § 2.11)</w:t>
+            </w:r>
+          </w:p>
+        </w:tc>
+      </w:tr>
+      <w:tr>
+        <w:tc>
+          <w:tcPr>
+            <w:tcW w:type="dxa" w:w="3402"/>
+          </w:tcPr>
+          <w:p>
+            <w:r/>
+            <w:r>
+              <w:rPr>
+                <w:sz w:val="18"/>
+              </w:rPr>
+              <w:t>Levée des réserves et remise du DOE</w:t>
+            </w:r>
+          </w:p>
+        </w:tc>
+        <w:tc>
+          <w:tcPr>
+            <w:tcW w:type="dxa" w:w="1984"/>
+          </w:tcPr>
+          <w:p>
+            <w:r/>
+            <w:r>
+              <w:rPr>
+                <w:sz w:val="18"/>
+              </w:rPr>
+              <w:t>Mois 5 - S4 (Jour 3)</w:t>
+            </w:r>
+          </w:p>
+        </w:tc>
+        <w:tc>
+          <w:tcPr>
+            <w:tcW w:type="dxa" w:w="3118"/>
+          </w:tcPr>
+          <w:p>
+            <w:r/>
+            <w:r>
+              <w:rPr>
+                <w:sz w:val="18"/>
+              </w:rPr>
+              <w:t>Clôture du lot dans le délai contractuel de 45 jours</w:t>
+            </w:r>
+          </w:p>
+        </w:tc>
+      </w:tr>
+    </w:tbl>
+    <w:p/>
+    <w:p>
+      <w:pPr>
+        <w:pStyle w:val="ListBullet"/>
+      </w:pPr>
+      <w:r>
+        <w:t>effectifs modulables de 2 à 5 personnes par phase de production, mobilisables sans délai en cas d'aléa (cf. chapitre 5, § 5.7 et § 5.9) ;</w:t>
       </w:r>
     </w:p>
     <w:p>
@@ -110,7 +449,7 @@
         <w:pStyle w:val="ListBullet"/>
       </w:pPr>
       <w:r>
-        <w:t>effectifs modulables de 2 à 5 personnes par phase, mobilisables sans délai en cas d'aléa (cf. chapitre 5, § 5.7 et § 5.9) ;</w:t>
+        <w:t>marge de sécurité de quatre semaines (Mois 4 - S4 à Mois 5 - S3) intégrée au planning avant la clôture du lot (cf. chapitre 5, § 5.8) ;</w:t>
       </w:r>
     </w:p>
     <w:p>
@@ -118,7 +457,7 @@
         <w:pStyle w:val="ListBullet"/>
       </w:pPr>
       <w:r>
-        <w:t>point d'avancement hebdomadaire systématique avec la MOE, permettant une alerte précoce (cf. chapitre 5, § 5.5) ;</w:t>
+        <w:t>point d'avancement hebdomadaire systématique avec la MOE lors des réunions de chantier, permettant une alerte précoce en cas d'écart (cf. chapitre 5, § 5.5) ;</w:t>
       </w:r>
     </w:p>
     <w:p>
@@ -126,9 +465,46 @@
         <w:pStyle w:val="ListBullet"/>
       </w:pPr>
       <w:r>
-        <w:t>aucune pénalité de retard visée sur la durée du chantier (cf. chapitre 1, § 1.5.2).</w:t>
+        <w:t>reporting d'avancement chiffré (% de tâches réalisées par phase) transmis chaque semaine au Conducteur d'Opération.</w:t>
       </w:r>
     </w:p>
+    <w:tbl>
+      <w:tblPr>
+        <w:tblStyle w:val="TableGrid"/>
+        <w:tblW w:type="auto" w:w="0"/>
+        <w:tblLook w:firstColumn="1" w:firstRow="1" w:lastColumn="0" w:lastRow="0" w:noHBand="0" w:noVBand="1" w:val="04A0"/>
+      </w:tblPr>
+      <w:tblGrid>
+        <w:gridCol w:w="10200"/>
+      </w:tblGrid>
+      <w:tr>
+        <w:tc>
+          <w:tcPr>
+            <w:tcW w:type="dxa" w:w="10200"/>
+            <w:shd w:val="clear" w:color="auto" w:fill="EAF1FA"/>
+          </w:tcPr>
+          <w:p>
+            <w:r/>
+            <w:r>
+              <w:rPr>
+                <w:b/>
+                <w:color w:val="2E74B5"/>
+                <w:sz w:val="19"/>
+              </w:rPr>
+              <w:t xml:space="preserve">Engagement France Décoration — </w:t>
+            </w:r>
+            <w:r>
+              <w:rPr>
+                <w:color w:val="1F3A5F"/>
+                <w:sz w:val="19"/>
+              </w:rPr>
+              <w:t>0 jour de dépassement du délai contractuel de 45 jours imputable à France Décoration, et 0 pénalité de retard visée sur la durée du chantier (cf. chapitre 1, § 1.5.2).</w:t>
+            </w:r>
+          </w:p>
+        </w:tc>
+      </w:tr>
+    </w:tbl>
+    <w:p/>
     <w:p>
       <w:pPr>
         <w:spacing w:before="240" w:after="80"/>
@@ -149,41 +525,377 @@
           <w:i w:val="0"/>
           <w:sz w:val="21"/>
         </w:rPr>
-        <w:t>France Décoration s'engage à adapter en permanence son organisation de chantier aux contraintes d'un établissement de santé en pleine activité, sans jamais compromettre la continuité des soins ni la sécurité des patients et des personnels.</w:t>
+        <w:t>France Décoration s'engage à adapter en permanence son organisation de chantier aux contraintes d'un établissement de santé en pleine activité, sans jamais compromettre la continuité des soins, la sécurité ni le confort des patients et des personnels.</w:t>
       </w:r>
     </w:p>
-    <w:p>
-      <w:pPr>
-        <w:pStyle w:val="ListBullet"/>
-      </w:pPr>
-      <w:r>
-        <w:t>plages horaires d'intervention et de livraison validées préalablement avec l'exploitant (cf. chapitre 1, § 1.5 et chapitre 6, § 6.1.1) ;</w:t>
-      </w:r>
-    </w:p>
-    <w:p>
-      <w:pPr>
-        <w:pStyle w:val="ListBullet"/>
-      </w:pPr>
-      <w:r>
-        <w:t>confinement et protection systématiques des zones adjacentes occupées, avec maintien d'un empoussièrement conforme aux seuils réglementaires (cf. chapitre 2, § 2.5 et chapitre 6, § 6.1.2) ;</w:t>
-      </w:r>
-    </w:p>
-    <w:p>
-      <w:pPr>
-        <w:pStyle w:val="ListBullet"/>
-      </w:pPr>
-      <w:r>
-        <w:t>personnel qualifié et sensibilisé à l'environnement hospitalier, avec encadrement certifié amiante Sous-section 4 (SS4) sur l'ensemble des postes clés (cf. chapitre 3, § 3.4) ;</w:t>
-      </w:r>
-    </w:p>
-    <w:p>
-      <w:pPr>
-        <w:pStyle w:val="ListBullet"/>
-      </w:pPr>
-      <w:r>
-        <w:t>nettoyage de fin de poste quotidien systématique sur chaque zone d'intervention (cf. chapitre 2, § 2.6).</w:t>
-      </w:r>
-    </w:p>
+    <w:tbl>
+      <w:tblPr>
+        <w:tblStyle w:val="TableGrid"/>
+        <w:tblW w:type="auto" w:w="0"/>
+        <w:jc w:val="center"/>
+        <w:tblLook w:firstColumn="1" w:firstRow="1" w:lastColumn="0" w:lastRow="0" w:noHBand="0" w:noVBand="1" w:val="04A0"/>
+      </w:tblPr>
+      <w:tblGrid>
+        <w:gridCol w:w="3400"/>
+        <w:gridCol w:w="3400"/>
+        <w:gridCol w:w="3400"/>
+      </w:tblGrid>
+      <w:tr>
+        <w:tc>
+          <w:tcPr>
+            <w:tcW w:type="dxa" w:w="2551"/>
+            <w:shd w:val="clear" w:color="auto" w:fill="2E74B5"/>
+          </w:tcPr>
+          <w:p>
+            <w:r/>
+            <w:r>
+              <w:rPr>
+                <w:b/>
+                <w:color w:val="FFFFFF"/>
+                <w:sz w:val="18"/>
+              </w:rPr>
+              <w:t>Exigence hospitalière</w:t>
+            </w:r>
+          </w:p>
+        </w:tc>
+        <w:tc>
+          <w:tcPr>
+            <w:tcW w:type="dxa" w:w="3969"/>
+            <w:shd w:val="clear" w:color="auto" w:fill="2E74B5"/>
+          </w:tcPr>
+          <w:p>
+            <w:r/>
+            <w:r>
+              <w:rPr>
+                <w:b/>
+                <w:color w:val="FFFFFF"/>
+                <w:sz w:val="18"/>
+              </w:rPr>
+              <w:t>Engagement France Décoration</w:t>
+            </w:r>
+          </w:p>
+        </w:tc>
+        <w:tc>
+          <w:tcPr>
+            <w:tcW w:type="dxa" w:w="1984"/>
+            <w:shd w:val="clear" w:color="auto" w:fill="2E74B5"/>
+          </w:tcPr>
+          <w:p>
+            <w:r/>
+            <w:r>
+              <w:rPr>
+                <w:b/>
+                <w:color w:val="FFFFFF"/>
+                <w:sz w:val="18"/>
+              </w:rPr>
+              <w:t>Référence</w:t>
+            </w:r>
+          </w:p>
+        </w:tc>
+      </w:tr>
+      <w:tr>
+        <w:tc>
+          <w:tcPr>
+            <w:tcW w:type="dxa" w:w="2551"/>
+          </w:tcPr>
+          <w:p>
+            <w:r/>
+            <w:r>
+              <w:rPr>
+                <w:sz w:val="18"/>
+              </w:rPr>
+              <w:t>Continuité de l'activité de soins</w:t>
+            </w:r>
+          </w:p>
+        </w:tc>
+        <w:tc>
+          <w:tcPr>
+            <w:tcW w:type="dxa" w:w="3969"/>
+          </w:tcPr>
+          <w:p>
+            <w:r/>
+            <w:r>
+              <w:rPr>
+                <w:sz w:val="18"/>
+              </w:rPr>
+              <w:t>Plages horaires d'intervention et de livraison validées préalablement avec l'exploitant ; interventions bruyantes signalées 48 h à l'avance</w:t>
+            </w:r>
+          </w:p>
+        </w:tc>
+        <w:tc>
+          <w:tcPr>
+            <w:tcW w:type="dxa" w:w="1984"/>
+          </w:tcPr>
+          <w:p>
+            <w:r/>
+            <w:r>
+              <w:rPr>
+                <w:sz w:val="18"/>
+              </w:rPr>
+              <w:t>Chapitre 1, § 1.5 ; chapitre 6, § 6.1.1</w:t>
+            </w:r>
+          </w:p>
+        </w:tc>
+      </w:tr>
+      <w:tr>
+        <w:tc>
+          <w:tcPr>
+            <w:tcW w:type="dxa" w:w="2551"/>
+          </w:tcPr>
+          <w:p>
+            <w:r/>
+            <w:r>
+              <w:rPr>
+                <w:sz w:val="18"/>
+              </w:rPr>
+              <w:t>Maîtrise de l'empoussièrement</w:t>
+            </w:r>
+          </w:p>
+        </w:tc>
+        <w:tc>
+          <w:tcPr>
+            <w:tcW w:type="dxa" w:w="3969"/>
+          </w:tcPr>
+          <w:p>
+            <w:r/>
+            <w:r>
+              <w:rPr>
+                <w:sz w:val="18"/>
+              </w:rPr>
+              <w:t>Confinement dynamique, outillage à aspiration intégrée, empoussièrement maintenu sous les seuils réglementaires (5 fibres/L) en zones adjacentes occupées</w:t>
+            </w:r>
+          </w:p>
+        </w:tc>
+        <w:tc>
+          <w:tcPr>
+            <w:tcW w:type="dxa" w:w="1984"/>
+          </w:tcPr>
+          <w:p>
+            <w:r/>
+            <w:r>
+              <w:rPr>
+                <w:sz w:val="18"/>
+              </w:rPr>
+              <w:t>Chapitre 2, § 2.5 ; chapitre 6, § 6.1.2</w:t>
+            </w:r>
+          </w:p>
+        </w:tc>
+      </w:tr>
+      <w:tr>
+        <w:tc>
+          <w:tcPr>
+            <w:tcW w:type="dxa" w:w="2551"/>
+          </w:tcPr>
+          <w:p>
+            <w:r/>
+            <w:r>
+              <w:rPr>
+                <w:sz w:val="18"/>
+              </w:rPr>
+              <w:t>Sécurité vis-à-vis des matériaux amiantés (bâtiment ancien)</w:t>
+            </w:r>
+          </w:p>
+        </w:tc>
+        <w:tc>
+          <w:tcPr>
+            <w:tcW w:type="dxa" w:w="3969"/>
+          </w:tcPr>
+          <w:p>
+            <w:r/>
+            <w:r>
+              <w:rPr>
+                <w:sz w:val="18"/>
+              </w:rPr>
+              <w:t>Encadrement certifié Sous-section 4 (SS4) sur l'ensemble des postes clés (Conducteur de Travaux et Chef de Chantier)</w:t>
+            </w:r>
+          </w:p>
+        </w:tc>
+        <w:tc>
+          <w:tcPr>
+            <w:tcW w:type="dxa" w:w="1984"/>
+          </w:tcPr>
+          <w:p>
+            <w:r/>
+            <w:r>
+              <w:rPr>
+                <w:sz w:val="18"/>
+              </w:rPr>
+              <w:t>Chapitre 3, § 3.4</w:t>
+            </w:r>
+          </w:p>
+        </w:tc>
+      </w:tr>
+      <w:tr>
+        <w:tc>
+          <w:tcPr>
+            <w:tcW w:type="dxa" w:w="2551"/>
+          </w:tcPr>
+          <w:p>
+            <w:r/>
+            <w:r>
+              <w:rPr>
+                <w:sz w:val="18"/>
+              </w:rPr>
+              <w:t>Propreté permanente des circulations</w:t>
+            </w:r>
+          </w:p>
+        </w:tc>
+        <w:tc>
+          <w:tcPr>
+            <w:tcW w:type="dxa" w:w="3969"/>
+          </w:tcPr>
+          <w:p>
+            <w:r/>
+            <w:r>
+              <w:rPr>
+                <w:sz w:val="18"/>
+              </w:rPr>
+              <w:t>Nettoyage de fin de poste quotidien systématique sur chaque zone d'intervention</w:t>
+            </w:r>
+          </w:p>
+        </w:tc>
+        <w:tc>
+          <w:tcPr>
+            <w:tcW w:type="dxa" w:w="1984"/>
+          </w:tcPr>
+          <w:p>
+            <w:r/>
+            <w:r>
+              <w:rPr>
+                <w:sz w:val="18"/>
+              </w:rPr>
+              <w:t>Chapitre 2, § 2.6</w:t>
+            </w:r>
+          </w:p>
+        </w:tc>
+      </w:tr>
+      <w:tr>
+        <w:tc>
+          <w:tcPr>
+            <w:tcW w:type="dxa" w:w="2551"/>
+          </w:tcPr>
+          <w:p>
+            <w:r/>
+            <w:r>
+              <w:rPr>
+                <w:sz w:val="18"/>
+              </w:rPr>
+              <w:t>Protection des patients et du mobilier hospitalier</w:t>
+            </w:r>
+          </w:p>
+        </w:tc>
+        <w:tc>
+          <w:tcPr>
+            <w:tcW w:type="dxa" w:w="3969"/>
+          </w:tcPr>
+          <w:p>
+            <w:r/>
+            <w:r>
+              <w:rPr>
+                <w:sz w:val="18"/>
+              </w:rPr>
+              <w:t>Confinement, housses de protection, signalétique de balisage sur toutes les zones adjacentes</w:t>
+            </w:r>
+          </w:p>
+        </w:tc>
+        <w:tc>
+          <w:tcPr>
+            <w:tcW w:type="dxa" w:w="1984"/>
+          </w:tcPr>
+          <w:p>
+            <w:r/>
+            <w:r>
+              <w:rPr>
+                <w:sz w:val="18"/>
+              </w:rPr>
+              <w:t>Chapitre 2, § 2.5</w:t>
+            </w:r>
+          </w:p>
+        </w:tc>
+      </w:tr>
+      <w:tr>
+        <w:tc>
+          <w:tcPr>
+            <w:tcW w:type="dxa" w:w="2551"/>
+          </w:tcPr>
+          <w:p>
+            <w:r/>
+            <w:r>
+              <w:rPr>
+                <w:sz w:val="18"/>
+              </w:rPr>
+              <w:t>Coordination avec les équipes soignantes</w:t>
+            </w:r>
+          </w:p>
+        </w:tc>
+        <w:tc>
+          <w:tcPr>
+            <w:tcW w:type="dxa" w:w="3969"/>
+          </w:tcPr>
+          <w:p>
+            <w:r/>
+            <w:r>
+              <w:rPr>
+                <w:sz w:val="18"/>
+              </w:rPr>
+              <w:t>Interlocuteur unique identifié pour toute demande de report ou d'adaptation ponctuelle des interventions</w:t>
+            </w:r>
+          </w:p>
+        </w:tc>
+        <w:tc>
+          <w:tcPr>
+            <w:tcW w:type="dxa" w:w="1984"/>
+          </w:tcPr>
+          <w:p>
+            <w:r/>
+            <w:r>
+              <w:rPr>
+                <w:sz w:val="18"/>
+              </w:rPr>
+              <w:t>Chapitre 3, § 3.2</w:t>
+            </w:r>
+          </w:p>
+        </w:tc>
+      </w:tr>
+    </w:tbl>
+    <w:p/>
+    <w:tbl>
+      <w:tblPr>
+        <w:tblStyle w:val="TableGrid"/>
+        <w:tblW w:type="auto" w:w="0"/>
+        <w:tblLook w:firstColumn="1" w:firstRow="1" w:lastColumn="0" w:lastRow="0" w:noHBand="0" w:noVBand="1" w:val="04A0"/>
+      </w:tblPr>
+      <w:tblGrid>
+        <w:gridCol w:w="10200"/>
+      </w:tblGrid>
+      <w:tr>
+        <w:tc>
+          <w:tcPr>
+            <w:tcW w:type="dxa" w:w="10200"/>
+            <w:shd w:val="clear" w:color="auto" w:fill="EAF1FA"/>
+          </w:tcPr>
+          <w:p>
+            <w:r/>
+            <w:r>
+              <w:rPr>
+                <w:b/>
+                <w:color w:val="2E74B5"/>
+                <w:sz w:val="19"/>
+              </w:rPr>
+              <w:t xml:space="preserve">Engagement France Décoration — </w:t>
+            </w:r>
+            <w:r>
+              <w:rPr>
+                <w:color w:val="1F3A5F"/>
+                <w:sz w:val="19"/>
+              </w:rPr>
+              <w:t>100% des interventions bruyantes ou générant un empoussièrement notifiées à l'exploitant au moins 48 h à l'avance, et 0 interruption de l'activité de soins imputable au chantier.</w:t>
+            </w:r>
+          </w:p>
+        </w:tc>
+      </w:tr>
+    </w:tbl>
+    <w:p/>
     <w:p>
       <w:pPr>
         <w:spacing w:before="240" w:after="80"/>
@@ -204,7 +916,302 @@
           <w:i w:val="0"/>
           <w:sz w:val="21"/>
         </w:rPr>
-        <w:t>France Décoration s'engage sur la conformité intégrale des ouvrages réalisés aux prescriptions du CCTP et aux normes en vigueur, à partir de produits exclusivement issus de son dossier de fiches techniques (cf. chapitre 4).</w:t>
+        <w:t>France Décoration s'engage sur la conformité intégrale des ouvrages réalisés aux prescriptions du CCTP et aux normes en vigueur, à partir de produits exclusivement issus de son dossier de fiches techniques (cf. chapitre 4), et sur un dispositif de contrôle qualité continu.</w:t>
+      </w:r>
+    </w:p>
+    <w:tbl>
+      <w:tblPr>
+        <w:tblStyle w:val="TableGrid"/>
+        <w:tblW w:type="auto" w:w="0"/>
+        <w:jc w:val="center"/>
+        <w:tblLook w:firstColumn="1" w:firstRow="1" w:lastColumn="0" w:lastRow="0" w:noHBand="0" w:noVBand="1" w:val="04A0"/>
+      </w:tblPr>
+      <w:tblGrid>
+        <w:gridCol w:w="3400"/>
+        <w:gridCol w:w="3400"/>
+        <w:gridCol w:w="3400"/>
+      </w:tblGrid>
+      <w:tr>
+        <w:tc>
+          <w:tcPr>
+            <w:tcW w:type="dxa" w:w="3685"/>
+            <w:shd w:val="clear" w:color="auto" w:fill="2E74B5"/>
+          </w:tcPr>
+          <w:p>
+            <w:r/>
+            <w:r>
+              <w:rPr>
+                <w:b/>
+                <w:color w:val="FFFFFF"/>
+                <w:sz w:val="18"/>
+              </w:rPr>
+              <w:t>Dispositif de contrôle</w:t>
+            </w:r>
+          </w:p>
+        </w:tc>
+        <w:tc>
+          <w:tcPr>
+            <w:tcW w:type="dxa" w:w="2835"/>
+            <w:shd w:val="clear" w:color="auto" w:fill="2E74B5"/>
+          </w:tcPr>
+          <w:p>
+            <w:r/>
+            <w:r>
+              <w:rPr>
+                <w:b/>
+                <w:color w:val="FFFFFF"/>
+                <w:sz w:val="18"/>
+              </w:rPr>
+              <w:t>Fréquence</w:t>
+            </w:r>
+          </w:p>
+        </w:tc>
+        <w:tc>
+          <w:tcPr>
+            <w:tcW w:type="dxa" w:w="2268"/>
+            <w:shd w:val="clear" w:color="auto" w:fill="2E74B5"/>
+          </w:tcPr>
+          <w:p>
+            <w:r/>
+            <w:r>
+              <w:rPr>
+                <w:b/>
+                <w:color w:val="FFFFFF"/>
+                <w:sz w:val="18"/>
+              </w:rPr>
+              <w:t>Objectif chiffré</w:t>
+            </w:r>
+          </w:p>
+        </w:tc>
+      </w:tr>
+      <w:tr>
+        <w:tc>
+          <w:tcPr>
+            <w:tcW w:type="dxa" w:w="3685"/>
+          </w:tcPr>
+          <w:p>
+            <w:r/>
+            <w:r>
+              <w:rPr>
+                <w:sz w:val="18"/>
+              </w:rPr>
+              <w:t>Autocontrôles par corps de métier</w:t>
+            </w:r>
+          </w:p>
+        </w:tc>
+        <w:tc>
+          <w:tcPr>
+            <w:tcW w:type="dxa" w:w="2835"/>
+          </w:tcPr>
+          <w:p>
+            <w:r/>
+            <w:r>
+              <w:rPr>
+                <w:sz w:val="18"/>
+              </w:rPr>
+              <w:t>À chaque étape avant passage à la phase suivante</w:t>
+            </w:r>
+          </w:p>
+        </w:tc>
+        <w:tc>
+          <w:tcPr>
+            <w:tcW w:type="dxa" w:w="2268"/>
+          </w:tcPr>
+          <w:p>
+            <w:r/>
+            <w:r>
+              <w:rPr>
+                <w:sz w:val="18"/>
+              </w:rPr>
+              <w:t>100% des étapes contrôlées avant validation</w:t>
+            </w:r>
+          </w:p>
+        </w:tc>
+      </w:tr>
+      <w:tr>
+        <w:tc>
+          <w:tcPr>
+            <w:tcW w:type="dxa" w:w="3685"/>
+          </w:tcPr>
+          <w:p>
+            <w:r/>
+            <w:r>
+              <w:rPr>
+                <w:sz w:val="18"/>
+              </w:rPr>
+              <w:t>Contrôle de conformité des produits (fiches techniques, FDS, PV)</w:t>
+            </w:r>
+          </w:p>
+        </w:tc>
+        <w:tc>
+          <w:tcPr>
+            <w:tcW w:type="dxa" w:w="2835"/>
+          </w:tcPr>
+          <w:p>
+            <w:r/>
+            <w:r>
+              <w:rPr>
+                <w:sz w:val="18"/>
+              </w:rPr>
+              <w:t>À réception de chaque livraison</w:t>
+            </w:r>
+          </w:p>
+        </w:tc>
+        <w:tc>
+          <w:tcPr>
+            <w:tcW w:type="dxa" w:w="2268"/>
+          </w:tcPr>
+          <w:p>
+            <w:r/>
+            <w:r>
+              <w:rPr>
+                <w:sz w:val="18"/>
+              </w:rPr>
+              <w:t>100% des produits tracés et validés par la MOE avant mise en œuvre</w:t>
+            </w:r>
+          </w:p>
+        </w:tc>
+      </w:tr>
+      <w:tr>
+        <w:tc>
+          <w:tcPr>
+            <w:tcW w:type="dxa" w:w="3685"/>
+          </w:tcPr>
+          <w:p>
+            <w:r/>
+            <w:r>
+              <w:rPr>
+                <w:sz w:val="18"/>
+              </w:rPr>
+              <w:t>Contrôle des supports avant mise en œuvre</w:t>
+            </w:r>
+          </w:p>
+        </w:tc>
+        <w:tc>
+          <w:tcPr>
+            <w:tcW w:type="dxa" w:w="2835"/>
+          </w:tcPr>
+          <w:p>
+            <w:r/>
+            <w:r>
+              <w:rPr>
+                <w:sz w:val="18"/>
+              </w:rPr>
+              <w:t>Avant chaque phase (plafonds, peinture, sols)</w:t>
+            </w:r>
+          </w:p>
+        </w:tc>
+        <w:tc>
+          <w:tcPr>
+            <w:tcW w:type="dxa" w:w="2268"/>
+          </w:tcPr>
+          <w:p>
+            <w:r/>
+            <w:r>
+              <w:rPr>
+                <w:sz w:val="18"/>
+              </w:rPr>
+              <w:t>0 mise en œuvre sur support non conforme</w:t>
+            </w:r>
+          </w:p>
+        </w:tc>
+      </w:tr>
+      <w:tr>
+        <w:tc>
+          <w:tcPr>
+            <w:tcW w:type="dxa" w:w="3685"/>
+          </w:tcPr>
+          <w:p>
+            <w:r/>
+            <w:r>
+              <w:rPr>
+                <w:sz w:val="18"/>
+              </w:rPr>
+              <w:t>Opérations Préalables à la Réception (OPR)</w:t>
+            </w:r>
+          </w:p>
+        </w:tc>
+        <w:tc>
+          <w:tcPr>
+            <w:tcW w:type="dxa" w:w="2835"/>
+          </w:tcPr>
+          <w:p>
+            <w:r/>
+            <w:r>
+              <w:rPr>
+                <w:sz w:val="18"/>
+              </w:rPr>
+              <w:t>Fin de chantier (Mois 5 - S4)</w:t>
+            </w:r>
+          </w:p>
+        </w:tc>
+        <w:tc>
+          <w:tcPr>
+            <w:tcW w:type="dxa" w:w="2268"/>
+          </w:tcPr>
+          <w:p>
+            <w:r/>
+            <w:r>
+              <w:rPr>
+                <w:sz w:val="18"/>
+              </w:rPr>
+              <w:t>Objectif de 0 réserve bloquante</w:t>
+            </w:r>
+          </w:p>
+        </w:tc>
+      </w:tr>
+      <w:tr>
+        <w:tc>
+          <w:tcPr>
+            <w:tcW w:type="dxa" w:w="3685"/>
+          </w:tcPr>
+          <w:p>
+            <w:r/>
+            <w:r>
+              <w:rPr>
+                <w:sz w:val="18"/>
+              </w:rPr>
+              <w:t>Constitution du DOE</w:t>
+            </w:r>
+          </w:p>
+        </w:tc>
+        <w:tc>
+          <w:tcPr>
+            <w:tcW w:type="dxa" w:w="2835"/>
+          </w:tcPr>
+          <w:p>
+            <w:r/>
+            <w:r>
+              <w:rPr>
+                <w:sz w:val="18"/>
+              </w:rPr>
+              <w:t>Fin de chantier</w:t>
+            </w:r>
+          </w:p>
+        </w:tc>
+        <w:tc>
+          <w:tcPr>
+            <w:tcW w:type="dxa" w:w="2268"/>
+          </w:tcPr>
+          <w:p>
+            <w:r/>
+            <w:r>
+              <w:rPr>
+                <w:sz w:val="18"/>
+              </w:rPr>
+              <w:t>Dossier complet remis à réception : fiches techniques, FDS, PV, certificats (cf. chapitre 4, § 4.10)</w:t>
+            </w:r>
+          </w:p>
+        </w:tc>
+      </w:tr>
+    </w:tbl>
+    <w:p/>
+    <w:p>
+      <w:pPr>
+        <w:pStyle w:val="ListBullet"/>
+      </w:pPr>
+      <w:r>
+        <w:t>100% des produits de préparation et de finition mis en œuvre sont de classe d'émission A+ dans l'air intérieur (cf. chapitre 4, § 4.8) ;</w:t>
       </w:r>
     </w:p>
     <w:p>
@@ -212,7 +1219,7 @@
         <w:pStyle w:val="ListBullet"/>
       </w:pPr>
       <w:r>
-        <w:t>100% des produits mis en œuvre de classe d'émission A+ dans l'air intérieur (cf. chapitre 4, § 4.8 et chapitre 6, § 6.1.5) ;</w:t>
+        <w:t>conformité systématique aux DTU en vigueur (DTU 59.1 peinture, DTU 53.2 sols souples, DTU 25.41 et 58.1 plafonds suspendus — cf. chapitre 4, § 4.9) ;</w:t>
       </w:r>
     </w:p>
     <w:p>
@@ -220,25 +1227,46 @@
         <w:pStyle w:val="ListBullet"/>
       </w:pPr>
       <w:r>
-        <w:t>autocontrôles systématiques à chaque étape de production, avant passage à la phase suivante (cf. chapitre 2, § 2.11) ;</w:t>
+        <w:t>traçabilité complète de chaque produit jusqu'à l'article du CCTP qu'il satisfait (cf. chapitre 4, tableaux de correspondance).</w:t>
       </w:r>
     </w:p>
-    <w:p>
-      <w:pPr>
-        <w:pStyle w:val="ListBullet"/>
-      </w:pPr>
-      <w:r>
-        <w:t>constitution d'un Dossier des Ouvrages Exécutés (DOE) complet, incluant fiches techniques, FDS, PV et certificats (cf. chapitre 2, § 2.13 et chapitre 4, § 4.10) ;</w:t>
-      </w:r>
-    </w:p>
-    <w:p>
-      <w:pPr>
-        <w:pStyle w:val="ListBullet"/>
-      </w:pPr>
-      <w:r>
-        <w:t>objectif visé de zéro réserve bloquante à l'issue des Opérations Préalables à la Réception (cf. chapitre 5, § 5.10).</w:t>
-      </w:r>
-    </w:p>
+    <w:tbl>
+      <w:tblPr>
+        <w:tblStyle w:val="TableGrid"/>
+        <w:tblW w:type="auto" w:w="0"/>
+        <w:tblLook w:firstColumn="1" w:firstRow="1" w:lastColumn="0" w:lastRow="0" w:noHBand="0" w:noVBand="1" w:val="04A0"/>
+      </w:tblPr>
+      <w:tblGrid>
+        <w:gridCol w:w="10200"/>
+      </w:tblGrid>
+      <w:tr>
+        <w:tc>
+          <w:tcPr>
+            <w:tcW w:type="dxa" w:w="10200"/>
+            <w:shd w:val="clear" w:color="auto" w:fill="EAF1FA"/>
+          </w:tcPr>
+          <w:p>
+            <w:r/>
+            <w:r>
+              <w:rPr>
+                <w:b/>
+                <w:color w:val="2E74B5"/>
+                <w:sz w:val="19"/>
+              </w:rPr>
+              <w:t xml:space="preserve">Engagement France Décoration — </w:t>
+            </w:r>
+            <w:r>
+              <w:rPr>
+                <w:color w:val="1F3A5F"/>
+                <w:sz w:val="19"/>
+              </w:rPr>
+              <w:t>Objectif de zéro réserve bloquante à l'issue des Opérations Préalables à la Réception, et conformité de 100% des ouvrages aux articles du CCTP Lot 3.</w:t>
+            </w:r>
+          </w:p>
+        </w:tc>
+      </w:tr>
+    </w:tbl>
+    <w:p/>
     <w:p>
       <w:pPr>
         <w:spacing w:before="240" w:after="80"/>
@@ -270,14 +1298,15 @@
         <w:tblLook w:firstColumn="1" w:firstRow="1" w:lastColumn="0" w:lastRow="0" w:noHBand="0" w:noVBand="1" w:val="04A0"/>
       </w:tblPr>
       <w:tblGrid>
-        <w:gridCol w:w="3400"/>
-        <w:gridCol w:w="3400"/>
-        <w:gridCol w:w="3400"/>
+        <w:gridCol w:w="2550"/>
+        <w:gridCol w:w="2550"/>
+        <w:gridCol w:w="2550"/>
+        <w:gridCol w:w="2550"/>
       </w:tblGrid>
       <w:tr>
         <w:tc>
           <w:tcPr>
-            <w:tcW w:type="dxa" w:w="2551"/>
+            <w:tcW w:type="dxa" w:w="1984"/>
             <w:shd w:val="clear" w:color="auto" w:fill="2E74B5"/>
           </w:tcPr>
           <w:p>
@@ -294,7 +1323,7 @@
         </w:tc>
         <w:tc>
           <w:tcPr>
-            <w:tcW w:type="dxa" w:w="2551"/>
+            <w:tcW w:type="dxa" w:w="1984"/>
             <w:shd w:val="clear" w:color="auto" w:fill="2E74B5"/>
           </w:tcPr>
           <w:p>
@@ -311,7 +1340,7 @@
         </w:tc>
         <w:tc>
           <w:tcPr>
-            <w:tcW w:type="dxa" w:w="3685"/>
+            <w:tcW w:type="dxa" w:w="3402"/>
             <w:shd w:val="clear" w:color="auto" w:fill="2E74B5"/>
           </w:tcPr>
           <w:p>
@@ -326,11 +1355,28 @@
             </w:r>
           </w:p>
         </w:tc>
+        <w:tc>
+          <w:tcPr>
+            <w:tcW w:type="dxa" w:w="1984"/>
+            <w:shd w:val="clear" w:color="auto" w:fill="2E74B5"/>
+          </w:tcPr>
+          <w:p>
+            <w:r/>
+            <w:r>
+              <w:rPr>
+                <w:b/>
+                <w:color w:val="FFFFFF"/>
+                <w:sz w:val="18"/>
+              </w:rPr>
+              <w:t>Disponibilité</w:t>
+            </w:r>
+          </w:p>
+        </w:tc>
       </w:tr>
       <w:tr>
         <w:tc>
           <w:tcPr>
-            <w:tcW w:type="dxa" w:w="2551"/>
+            <w:tcW w:type="dxa" w:w="1984"/>
           </w:tcPr>
           <w:p>
             <w:r/>
@@ -344,7 +1390,7 @@
         </w:tc>
         <w:tc>
           <w:tcPr>
-            <w:tcW w:type="dxa" w:w="2551"/>
+            <w:tcW w:type="dxa" w:w="1984"/>
           </w:tcPr>
           <w:p>
             <w:r/>
@@ -358,7 +1404,7 @@
         </w:tc>
         <w:tc>
           <w:tcPr>
-            <w:tcW w:type="dxa" w:w="3685"/>
+            <w:tcW w:type="dxa" w:w="3402"/>
           </w:tcPr>
           <w:p>
             <w:r/>
@@ -370,11 +1416,25 @@
             </w:r>
           </w:p>
         </w:tc>
+        <w:tc>
+          <w:tcPr>
+            <w:tcW w:type="dxa" w:w="1984"/>
+          </w:tcPr>
+          <w:p>
+            <w:r/>
+            <w:r>
+              <w:rPr>
+                <w:sz w:val="18"/>
+              </w:rPr>
+              <w:t>Joignable aux heures ouvrées, réponse sous 24 h</w:t>
+            </w:r>
+          </w:p>
+        </w:tc>
       </w:tr>
       <w:tr>
         <w:tc>
           <w:tcPr>
-            <w:tcW w:type="dxa" w:w="2551"/>
+            <w:tcW w:type="dxa" w:w="1984"/>
           </w:tcPr>
           <w:p>
             <w:r/>
@@ -388,7 +1448,7 @@
         </w:tc>
         <w:tc>
           <w:tcPr>
-            <w:tcW w:type="dxa" w:w="2551"/>
+            <w:tcW w:type="dxa" w:w="1984"/>
           </w:tcPr>
           <w:p>
             <w:r/>
@@ -402,7 +1462,7 @@
         </w:tc>
         <w:tc>
           <w:tcPr>
-            <w:tcW w:type="dxa" w:w="3685"/>
+            <w:tcW w:type="dxa" w:w="3402"/>
           </w:tcPr>
           <w:p>
             <w:r/>
@@ -414,11 +1474,25 @@
             </w:r>
           </w:p>
         </w:tc>
+        <w:tc>
+          <w:tcPr>
+            <w:tcW w:type="dxa" w:w="1984"/>
+          </w:tcPr>
+          <w:p>
+            <w:r/>
+            <w:r>
+              <w:rPr>
+                <w:sz w:val="18"/>
+              </w:rPr>
+              <w:t>Présent aux réunions de chantier, joignable en continu pendant les phases actives</w:t>
+            </w:r>
+          </w:p>
+        </w:tc>
       </w:tr>
       <w:tr>
         <w:tc>
           <w:tcPr>
-            <w:tcW w:type="dxa" w:w="2551"/>
+            <w:tcW w:type="dxa" w:w="1984"/>
           </w:tcPr>
           <w:p>
             <w:r/>
@@ -432,7 +1506,7 @@
         </w:tc>
         <w:tc>
           <w:tcPr>
-            <w:tcW w:type="dxa" w:w="2551"/>
+            <w:tcW w:type="dxa" w:w="1984"/>
           </w:tcPr>
           <w:p>
             <w:r/>
@@ -446,7 +1520,7 @@
         </w:tc>
         <w:tc>
           <w:tcPr>
-            <w:tcW w:type="dxa" w:w="3685"/>
+            <w:tcW w:type="dxa" w:w="3402"/>
           </w:tcPr>
           <w:p>
             <w:r/>
@@ -458,19 +1532,243 @@
             </w:r>
           </w:p>
         </w:tc>
+        <w:tc>
+          <w:tcPr>
+            <w:tcW w:type="dxa" w:w="1984"/>
+          </w:tcPr>
+          <w:p>
+            <w:r/>
+            <w:r>
+              <w:rPr>
+                <w:sz w:val="18"/>
+              </w:rPr>
+              <w:t>Présent sur site en permanence pendant les phases de production</w:t>
+            </w:r>
+          </w:p>
+        </w:tc>
       </w:tr>
     </w:tbl>
     <w:p/>
     <w:p>
+      <w:pPr>
+        <w:spacing w:before="160" w:after="60"/>
+      </w:pPr>
       <w:r>
         <w:rPr>
-          <w:b w:val="0"/>
-          <w:i w:val="0"/>
+          <w:b/>
+          <w:i/>
+          <w:color w:val="2E74B5"/>
           <w:sz w:val="21"/>
         </w:rPr>
-        <w:t>Un délai de réactivité maximal de 24 heures est garanti pour toute sollicitation de la MOE ou de l'AP-HP (question technique, demande de reprise, incident), et de 48 heures pour la mobilisation de moyens supplémentaires en cas d'aléa avéré (cf. chapitre 5, § 5.9).</w:t>
+        <w:t>Délais de réactivité garantis</w:t>
       </w:r>
     </w:p>
+    <w:tbl>
+      <w:tblPr>
+        <w:tblStyle w:val="TableGrid"/>
+        <w:tblW w:type="auto" w:w="0"/>
+        <w:jc w:val="center"/>
+        <w:tblLook w:firstColumn="1" w:firstRow="1" w:lastColumn="0" w:lastRow="0" w:noHBand="0" w:noVBand="1" w:val="04A0"/>
+      </w:tblPr>
+      <w:tblGrid>
+        <w:gridCol w:w="5100"/>
+        <w:gridCol w:w="5100"/>
+      </w:tblGrid>
+      <w:tr>
+        <w:tc>
+          <w:tcPr>
+            <w:tcW w:type="dxa" w:w="5953"/>
+            <w:shd w:val="clear" w:color="auto" w:fill="2E74B5"/>
+          </w:tcPr>
+          <w:p>
+            <w:r/>
+            <w:r>
+              <w:rPr>
+                <w:b/>
+                <w:color w:val="FFFFFF"/>
+                <w:sz w:val="18"/>
+              </w:rPr>
+              <w:t>Type de sollicitation</w:t>
+            </w:r>
+          </w:p>
+        </w:tc>
+        <w:tc>
+          <w:tcPr>
+            <w:tcW w:type="dxa" w:w="2835"/>
+            <w:shd w:val="clear" w:color="auto" w:fill="2E74B5"/>
+          </w:tcPr>
+          <w:p>
+            <w:r/>
+            <w:r>
+              <w:rPr>
+                <w:b/>
+                <w:color w:val="FFFFFF"/>
+                <w:sz w:val="18"/>
+              </w:rPr>
+              <w:t>Délai de réponse garanti</w:t>
+            </w:r>
+          </w:p>
+        </w:tc>
+      </w:tr>
+      <w:tr>
+        <w:tc>
+          <w:tcPr>
+            <w:tcW w:type="dxa" w:w="5953"/>
+          </w:tcPr>
+          <w:p>
+            <w:r/>
+            <w:r>
+              <w:rPr>
+                <w:sz w:val="18"/>
+              </w:rPr>
+              <w:t>Question technique ou demande d'information de la MOE / AP-HP</w:t>
+            </w:r>
+          </w:p>
+        </w:tc>
+        <w:tc>
+          <w:tcPr>
+            <w:tcW w:type="dxa" w:w="2835"/>
+          </w:tcPr>
+          <w:p>
+            <w:r/>
+            <w:r>
+              <w:rPr>
+                <w:sz w:val="18"/>
+              </w:rPr>
+              <w:t>24 heures</w:t>
+            </w:r>
+          </w:p>
+        </w:tc>
+      </w:tr>
+      <w:tr>
+        <w:tc>
+          <w:tcPr>
+            <w:tcW w:type="dxa" w:w="5953"/>
+          </w:tcPr>
+          <w:p>
+            <w:r/>
+            <w:r>
+              <w:rPr>
+                <w:sz w:val="18"/>
+              </w:rPr>
+              <w:t>Demande de reprise ou de correction ponctuelle</w:t>
+            </w:r>
+          </w:p>
+        </w:tc>
+        <w:tc>
+          <w:tcPr>
+            <w:tcW w:type="dxa" w:w="2835"/>
+          </w:tcPr>
+          <w:p>
+            <w:r/>
+            <w:r>
+              <w:rPr>
+                <w:sz w:val="18"/>
+              </w:rPr>
+              <w:t>48 heures pour l'intervention corrective</w:t>
+            </w:r>
+          </w:p>
+        </w:tc>
+      </w:tr>
+      <w:tr>
+        <w:tc>
+          <w:tcPr>
+            <w:tcW w:type="dxa" w:w="5953"/>
+          </w:tcPr>
+          <w:p>
+            <w:r/>
+            <w:r>
+              <w:rPr>
+                <w:sz w:val="18"/>
+              </w:rPr>
+              <w:t>Mobilisation de moyens supplémentaires en cas d'aléa avéré</w:t>
+            </w:r>
+          </w:p>
+        </w:tc>
+        <w:tc>
+          <w:tcPr>
+            <w:tcW w:type="dxa" w:w="2835"/>
+          </w:tcPr>
+          <w:p>
+            <w:r/>
+            <w:r>
+              <w:rPr>
+                <w:sz w:val="18"/>
+              </w:rPr>
+              <w:t>48 heures (cf. chapitre 5, § 5.9)</w:t>
+            </w:r>
+          </w:p>
+        </w:tc>
+      </w:tr>
+      <w:tr>
+        <w:tc>
+          <w:tcPr>
+            <w:tcW w:type="dxa" w:w="5953"/>
+          </w:tcPr>
+          <w:p>
+            <w:r/>
+            <w:r>
+              <w:rPr>
+                <w:sz w:val="18"/>
+              </w:rPr>
+              <w:t>Incident ou situation d'urgence sur site</w:t>
+            </w:r>
+          </w:p>
+        </w:tc>
+        <w:tc>
+          <w:tcPr>
+            <w:tcW w:type="dxa" w:w="2835"/>
+          </w:tcPr>
+          <w:p>
+            <w:r/>
+            <w:r>
+              <w:rPr>
+                <w:sz w:val="18"/>
+              </w:rPr>
+              <w:t>Intervention immédiate du Chef de Chantier, information de l'encadrement sous 1 heure</w:t>
+            </w:r>
+          </w:p>
+        </w:tc>
+      </w:tr>
+    </w:tbl>
+    <w:p/>
+    <w:tbl>
+      <w:tblPr>
+        <w:tblStyle w:val="TableGrid"/>
+        <w:tblW w:type="auto" w:w="0"/>
+        <w:tblLook w:firstColumn="1" w:firstRow="1" w:lastColumn="0" w:lastRow="0" w:noHBand="0" w:noVBand="1" w:val="04A0"/>
+      </w:tblPr>
+      <w:tblGrid>
+        <w:gridCol w:w="10200"/>
+      </w:tblGrid>
+      <w:tr>
+        <w:tc>
+          <w:tcPr>
+            <w:tcW w:type="dxa" w:w="10200"/>
+            <w:shd w:val="clear" w:color="auto" w:fill="EAF1FA"/>
+          </w:tcPr>
+          <w:p>
+            <w:r/>
+            <w:r>
+              <w:rPr>
+                <w:b/>
+                <w:color w:val="2E74B5"/>
+                <w:sz w:val="19"/>
+              </w:rPr>
+              <w:t xml:space="preserve">Engagement France Décoration — </w:t>
+            </w:r>
+            <w:r>
+              <w:rPr>
+                <w:color w:val="1F3A5F"/>
+                <w:sz w:val="19"/>
+              </w:rPr>
+              <w:t>Délai de réponse garanti de 24 h pour toute sollicitation de la MOE ou de l'AP-HP, et de 48 h pour la mobilisation de moyens supplémentaires en cas d'aléa.</w:t>
+            </w:r>
+          </w:p>
+        </w:tc>
+      </w:tr>
+    </w:tbl>
+    <w:p/>
     <w:p>
       <w:pPr>
         <w:spacing w:before="240" w:after="80"/>
@@ -494,12 +1792,299 @@
         <w:t>France Décoration s'engage à assurer une continuité totale de ses effectifs sur toute la durée du chantier, y compris en période estivale, par un dispositif de doublement des fonctions d'encadrement et un vivier de personnel qualifié mobilisable sans délai.</w:t>
       </w:r>
     </w:p>
+    <w:tbl>
+      <w:tblPr>
+        <w:tblStyle w:val="TableGrid"/>
+        <w:tblW w:type="auto" w:w="0"/>
+        <w:jc w:val="center"/>
+        <w:tblLook w:firstColumn="1" w:firstRow="1" w:lastColumn="0" w:lastRow="0" w:noHBand="0" w:noVBand="1" w:val="04A0"/>
+      </w:tblPr>
+      <w:tblGrid>
+        <w:gridCol w:w="3400"/>
+        <w:gridCol w:w="3400"/>
+        <w:gridCol w:w="3400"/>
+      </w:tblGrid>
+      <w:tr>
+        <w:tc>
+          <w:tcPr>
+            <w:tcW w:type="dxa" w:w="3685"/>
+            <w:shd w:val="clear" w:color="auto" w:fill="2E74B5"/>
+          </w:tcPr>
+          <w:p>
+            <w:r/>
+            <w:r>
+              <w:rPr>
+                <w:b/>
+                <w:color w:val="FFFFFF"/>
+                <w:sz w:val="18"/>
+              </w:rPr>
+              <w:t>Phase</w:t>
+            </w:r>
+          </w:p>
+        </w:tc>
+        <w:tc>
+          <w:tcPr>
+            <w:tcW w:type="dxa" w:w="2551"/>
+            <w:shd w:val="clear" w:color="auto" w:fill="2E74B5"/>
+          </w:tcPr>
+          <w:p>
+            <w:r/>
+            <w:r>
+              <w:rPr>
+                <w:b/>
+                <w:color w:val="FFFFFF"/>
+                <w:sz w:val="18"/>
+              </w:rPr>
+              <w:t>Effectif de base</w:t>
+            </w:r>
+          </w:p>
+        </w:tc>
+        <w:tc>
+          <w:tcPr>
+            <w:tcW w:type="dxa" w:w="2551"/>
+            <w:shd w:val="clear" w:color="auto" w:fill="2E74B5"/>
+          </w:tcPr>
+          <w:p>
+            <w:r/>
+            <w:r>
+              <w:rPr>
+                <w:b/>
+                <w:color w:val="FFFFFF"/>
+                <w:sz w:val="18"/>
+              </w:rPr>
+              <w:t>Effectif renforcé possible</w:t>
+            </w:r>
+          </w:p>
+        </w:tc>
+      </w:tr>
+      <w:tr>
+        <w:tc>
+          <w:tcPr>
+            <w:tcW w:type="dxa" w:w="3685"/>
+          </w:tcPr>
+          <w:p>
+            <w:r/>
+            <w:r>
+              <w:rPr>
+                <w:sz w:val="18"/>
+              </w:rPr>
+              <w:t>Préparation / études d'exécution</w:t>
+            </w:r>
+          </w:p>
+        </w:tc>
+        <w:tc>
+          <w:tcPr>
+            <w:tcW w:type="dxa" w:w="2551"/>
+          </w:tcPr>
+          <w:p>
+            <w:r/>
+            <w:r>
+              <w:rPr>
+                <w:sz w:val="18"/>
+              </w:rPr>
+              <w:t>3 personnes</w:t>
+            </w:r>
+          </w:p>
+        </w:tc>
+        <w:tc>
+          <w:tcPr>
+            <w:tcW w:type="dxa" w:w="2551"/>
+          </w:tcPr>
+          <w:p>
+            <w:r/>
+            <w:r>
+              <w:rPr>
+                <w:sz w:val="18"/>
+              </w:rPr>
+              <w:t>—</w:t>
+            </w:r>
+          </w:p>
+        </w:tc>
+      </w:tr>
+      <w:tr>
+        <w:tc>
+          <w:tcPr>
+            <w:tcW w:type="dxa" w:w="3685"/>
+          </w:tcPr>
+          <w:p>
+            <w:r/>
+            <w:r>
+              <w:rPr>
+                <w:sz w:val="18"/>
+              </w:rPr>
+              <w:t>Faux plafonds</w:t>
+            </w:r>
+          </w:p>
+        </w:tc>
+        <w:tc>
+          <w:tcPr>
+            <w:tcW w:type="dxa" w:w="2551"/>
+          </w:tcPr>
+          <w:p>
+            <w:r/>
+            <w:r>
+              <w:rPr>
+                <w:sz w:val="18"/>
+              </w:rPr>
+              <w:t>3 personnes</w:t>
+            </w:r>
+          </w:p>
+        </w:tc>
+        <w:tc>
+          <w:tcPr>
+            <w:tcW w:type="dxa" w:w="2551"/>
+          </w:tcPr>
+          <w:p>
+            <w:r/>
+            <w:r>
+              <w:rPr>
+                <w:sz w:val="18"/>
+              </w:rPr>
+              <w:t>jusqu'à 5 personnes</w:t>
+            </w:r>
+          </w:p>
+        </w:tc>
+      </w:tr>
+      <w:tr>
+        <w:tc>
+          <w:tcPr>
+            <w:tcW w:type="dxa" w:w="3685"/>
+          </w:tcPr>
+          <w:p>
+            <w:r/>
+            <w:r>
+              <w:rPr>
+                <w:sz w:val="18"/>
+              </w:rPr>
+              <w:t>Peinture</w:t>
+            </w:r>
+          </w:p>
+        </w:tc>
+        <w:tc>
+          <w:tcPr>
+            <w:tcW w:type="dxa" w:w="2551"/>
+          </w:tcPr>
+          <w:p>
+            <w:r/>
+            <w:r>
+              <w:rPr>
+                <w:sz w:val="18"/>
+              </w:rPr>
+              <w:t>3 personnes</w:t>
+            </w:r>
+          </w:p>
+        </w:tc>
+        <w:tc>
+          <w:tcPr>
+            <w:tcW w:type="dxa" w:w="2551"/>
+          </w:tcPr>
+          <w:p>
+            <w:r/>
+            <w:r>
+              <w:rPr>
+                <w:sz w:val="18"/>
+              </w:rPr>
+              <w:t>jusqu'à 5 personnes</w:t>
+            </w:r>
+          </w:p>
+        </w:tc>
+      </w:tr>
+      <w:tr>
+        <w:tc>
+          <w:tcPr>
+            <w:tcW w:type="dxa" w:w="3685"/>
+          </w:tcPr>
+          <w:p>
+            <w:r/>
+            <w:r>
+              <w:rPr>
+                <w:sz w:val="18"/>
+              </w:rPr>
+              <w:t>Sols souples / reprises murales</w:t>
+            </w:r>
+          </w:p>
+        </w:tc>
+        <w:tc>
+          <w:tcPr>
+            <w:tcW w:type="dxa" w:w="2551"/>
+          </w:tcPr>
+          <w:p>
+            <w:r/>
+            <w:r>
+              <w:rPr>
+                <w:sz w:val="18"/>
+              </w:rPr>
+              <w:t>2 personnes</w:t>
+            </w:r>
+          </w:p>
+        </w:tc>
+        <w:tc>
+          <w:tcPr>
+            <w:tcW w:type="dxa" w:w="2551"/>
+          </w:tcPr>
+          <w:p>
+            <w:r/>
+            <w:r>
+              <w:rPr>
+                <w:sz w:val="18"/>
+              </w:rPr>
+              <w:t>jusqu'à 5 personnes</w:t>
+            </w:r>
+          </w:p>
+        </w:tc>
+      </w:tr>
+      <w:tr>
+        <w:tc>
+          <w:tcPr>
+            <w:tcW w:type="dxa" w:w="3685"/>
+          </w:tcPr>
+          <w:p>
+            <w:r/>
+            <w:r>
+              <w:rPr>
+                <w:sz w:val="18"/>
+              </w:rPr>
+              <w:t>Nettoyage général / OPR / réserves</w:t>
+            </w:r>
+          </w:p>
+        </w:tc>
+        <w:tc>
+          <w:tcPr>
+            <w:tcW w:type="dxa" w:w="2551"/>
+          </w:tcPr>
+          <w:p>
+            <w:r/>
+            <w:r>
+              <w:rPr>
+                <w:sz w:val="18"/>
+              </w:rPr>
+              <w:t>2 personnes</w:t>
+            </w:r>
+          </w:p>
+        </w:tc>
+        <w:tc>
+          <w:tcPr>
+            <w:tcW w:type="dxa" w:w="2551"/>
+          </w:tcPr>
+          <w:p>
+            <w:r/>
+            <w:r>
+              <w:rPr>
+                <w:sz w:val="18"/>
+              </w:rPr>
+              <w:t>—</w:t>
+            </w:r>
+          </w:p>
+        </w:tc>
+      </w:tr>
+    </w:tbl>
+    <w:p/>
     <w:p>
       <w:pPr>
         <w:pStyle w:val="ListBullet"/>
       </w:pPr>
       <w:r>
-        <w:t>continuité assurée par doublement des fonctions Conducteur de Travaux / Chef de Chantier en cas d'absence imprévue (cf. chapitre 3, § 3.12) ;</w:t>
+        <w:t>continuité assurée par doublement des fonctions Conducteur de Travaux / Chef de Chantier en cas d'absence imprévue de l'un des deux (cf. chapitre 3, § 3.12) ;</w:t>
       </w:r>
     </w:p>
     <w:p>
@@ -507,7 +2092,7 @@
         <w:pStyle w:val="ListBullet"/>
       </w:pPr>
       <w:r>
-        <w:t>effectif de base de 9 intervenants nommément identifiés et qualifiés, répartis en 3 équipes (faux plafonds, peinture, sols souples — cf. chapitre 3, § 3.3 et § 3.4) ;</w:t>
+        <w:t>effectif de base de 9 intervenants nommément identifiés et qualifiés, répartis en 3 équipes dédiées (faux plafonds, peinture, sols souples — cf. chapitre 3, § 3.3 et § 3.4) ;</w:t>
       </w:r>
     </w:p>
     <w:p>
@@ -515,7 +2100,7 @@
         <w:pStyle w:val="ListBullet"/>
       </w:pPr>
       <w:r>
-        <w:t>capacité de renfort jusqu'à 5 personnes par phase sans recomposition d'équipe (cf. chapitre 5, § 5.7) ;</w:t>
+        <w:t>capacité de renfort jusqu'à 5 personnes par phase de production sans recomposition d'équipe ni interruption de chantier (cf. chapitre 5, § 5.7) ;</w:t>
       </w:r>
     </w:p>
     <w:p>
@@ -523,9 +2108,46 @@
         <w:pStyle w:val="ListBullet"/>
       </w:pPr>
       <w:r>
-        <w:t>aucune interruption de chantier visée sur la durée du lot, hors aléa majeur relevant d'un autre corps d'état.</w:t>
+        <w:t>personnel certifié amiante Sous-section 4 (SS4) sur l'ensemble des fonctions d'encadrement, garantissant la continuité de compétence même en cas de remplacement ponctuel.</w:t>
       </w:r>
     </w:p>
+    <w:tbl>
+      <w:tblPr>
+        <w:tblStyle w:val="TableGrid"/>
+        <w:tblW w:type="auto" w:w="0"/>
+        <w:tblLook w:firstColumn="1" w:firstRow="1" w:lastColumn="0" w:lastRow="0" w:noHBand="0" w:noVBand="1" w:val="04A0"/>
+      </w:tblPr>
+      <w:tblGrid>
+        <w:gridCol w:w="10200"/>
+      </w:tblGrid>
+      <w:tr>
+        <w:tc>
+          <w:tcPr>
+            <w:tcW w:type="dxa" w:w="10200"/>
+            <w:shd w:val="clear" w:color="auto" w:fill="EAF1FA"/>
+          </w:tcPr>
+          <w:p>
+            <w:r/>
+            <w:r>
+              <w:rPr>
+                <w:b/>
+                <w:color w:val="2E74B5"/>
+                <w:sz w:val="19"/>
+              </w:rPr>
+              <w:t xml:space="preserve">Engagement France Décoration — </w:t>
+            </w:r>
+            <w:r>
+              <w:rPr>
+                <w:color w:val="1F3A5F"/>
+                <w:sz w:val="19"/>
+              </w:rPr>
+              <w:t>0 interruption de chantier visée sur la durée du lot, hors aléa majeur relevant d'un autre corps d'état, et continuité de l'encadrement garantie à 100% par doublement des fonctions clés.</w:t>
+            </w:r>
+          </w:p>
+        </w:tc>
+      </w:tr>
+    </w:tbl>
+    <w:p/>
     <w:p>
       <w:pPr>
         <w:spacing w:before="240" w:after="80"/>
@@ -557,13 +2179,14 @@
         <w:tblLook w:firstColumn="1" w:firstRow="1" w:lastColumn="0" w:lastRow="0" w:noHBand="0" w:noVBand="1" w:val="04A0"/>
       </w:tblPr>
       <w:tblGrid>
-        <w:gridCol w:w="5100"/>
-        <w:gridCol w:w="5100"/>
+        <w:gridCol w:w="3400"/>
+        <w:gridCol w:w="3400"/>
+        <w:gridCol w:w="3400"/>
       </w:tblGrid>
       <w:tr>
         <w:tc>
           <w:tcPr>
-            <w:tcW w:type="dxa" w:w="5102"/>
+            <w:tcW w:type="dxa" w:w="3118"/>
             <w:shd w:val="clear" w:color="auto" w:fill="2E74B5"/>
           </w:tcPr>
           <w:p>
@@ -580,7 +2203,7 @@
         </w:tc>
         <w:tc>
           <w:tcPr>
-            <w:tcW w:type="dxa" w:w="3402"/>
+            <w:tcW w:type="dxa" w:w="3118"/>
             <w:shd w:val="clear" w:color="auto" w:fill="2E74B5"/>
           </w:tcPr>
           <w:p>
@@ -595,11 +2218,28 @@
             </w:r>
           </w:p>
         </w:tc>
+        <w:tc>
+          <w:tcPr>
+            <w:tcW w:type="dxa" w:w="2551"/>
+            <w:shd w:val="clear" w:color="auto" w:fill="2E74B5"/>
+          </w:tcPr>
+          <w:p>
+            <w:r/>
+            <w:r>
+              <w:rPr>
+                <w:b/>
+                <w:color w:val="FFFFFF"/>
+                <w:sz w:val="18"/>
+              </w:rPr>
+              <w:t>Mode de vérification</w:t>
+            </w:r>
+          </w:p>
+        </w:tc>
       </w:tr>
       <w:tr>
         <w:tc>
           <w:tcPr>
-            <w:tcW w:type="dxa" w:w="5102"/>
+            <w:tcW w:type="dxa" w:w="3118"/>
           </w:tcPr>
           <w:p>
             <w:r/>
@@ -613,7 +2253,7 @@
         </w:tc>
         <w:tc>
           <w:tcPr>
-            <w:tcW w:type="dxa" w:w="3402"/>
+            <w:tcW w:type="dxa" w:w="3118"/>
           </w:tcPr>
           <w:p>
             <w:r/>
@@ -625,11 +2265,25 @@
             </w:r>
           </w:p>
         </w:tc>
+        <w:tc>
+          <w:tcPr>
+            <w:tcW w:type="dxa" w:w="2551"/>
+          </w:tcPr>
+          <w:p>
+            <w:r/>
+            <w:r>
+              <w:rPr>
+                <w:sz w:val="18"/>
+              </w:rPr>
+              <w:t>Bordereaux de suivi (BSD/BSDA) et bilan de fin de chantier</w:t>
+            </w:r>
+          </w:p>
+        </w:tc>
       </w:tr>
       <w:tr>
         <w:tc>
           <w:tcPr>
-            <w:tcW w:type="dxa" w:w="5102"/>
+            <w:tcW w:type="dxa" w:w="3118"/>
           </w:tcPr>
           <w:p>
             <w:r/>
@@ -643,7 +2297,7 @@
         </w:tc>
         <w:tc>
           <w:tcPr>
-            <w:tcW w:type="dxa" w:w="3402"/>
+            <w:tcW w:type="dxa" w:w="3118"/>
           </w:tcPr>
           <w:p>
             <w:r/>
@@ -655,11 +2309,25 @@
             </w:r>
           </w:p>
         </w:tc>
+        <w:tc>
+          <w:tcPr>
+            <w:tcW w:type="dxa" w:w="2551"/>
+          </w:tcPr>
+          <w:p>
+            <w:r/>
+            <w:r>
+              <w:rPr>
+                <w:sz w:val="18"/>
+              </w:rPr>
+              <w:t>Contrôle hebdomadaire par le Chef de Chantier</w:t>
+            </w:r>
+          </w:p>
+        </w:tc>
       </w:tr>
       <w:tr>
         <w:tc>
           <w:tcPr>
-            <w:tcW w:type="dxa" w:w="5102"/>
+            <w:tcW w:type="dxa" w:w="3118"/>
           </w:tcPr>
           <w:p>
             <w:r/>
@@ -673,7 +2341,7 @@
         </w:tc>
         <w:tc>
           <w:tcPr>
-            <w:tcW w:type="dxa" w:w="3402"/>
+            <w:tcW w:type="dxa" w:w="3118"/>
           </w:tcPr>
           <w:p>
             <w:r/>
@@ -681,7 +2349,21 @@
               <w:rPr>
                 <w:sz w:val="18"/>
               </w:rPr>
-              <w:t>≈ 4,0 tonnes, avec traçabilité intégrale par bordereaux BSD/BSDA</w:t>
+              <w:t>≈ 4,0 tonnes, traçabilité intégrale</w:t>
+            </w:r>
+          </w:p>
+        </w:tc>
+        <w:tc>
+          <w:tcPr>
+            <w:tcW w:type="dxa" w:w="2551"/>
+          </w:tcPr>
+          <w:p>
+            <w:r/>
+            <w:r>
+              <w:rPr>
+                <w:sz w:val="18"/>
+              </w:rPr>
+              <w:t>Registre Trackdéchets</w:t>
             </w:r>
           </w:p>
         </w:tc>
@@ -689,7 +2371,7 @@
       <w:tr>
         <w:tc>
           <w:tcPr>
-            <w:tcW w:type="dxa" w:w="5102"/>
+            <w:tcW w:type="dxa" w:w="3118"/>
           </w:tcPr>
           <w:p>
             <w:r/>
@@ -703,7 +2385,7 @@
         </w:tc>
         <w:tc>
           <w:tcPr>
-            <w:tcW w:type="dxa" w:w="3402"/>
+            <w:tcW w:type="dxa" w:w="3118"/>
           </w:tcPr>
           <w:p>
             <w:r/>
@@ -715,11 +2397,25 @@
             </w:r>
           </w:p>
         </w:tc>
+        <w:tc>
+          <w:tcPr>
+            <w:tcW w:type="dxa" w:w="2551"/>
+          </w:tcPr>
+          <w:p>
+            <w:r/>
+            <w:r>
+              <w:rPr>
+                <w:sz w:val="18"/>
+              </w:rPr>
+              <w:t>Fiches techniques et FDS (cf. chapitre 4)</w:t>
+            </w:r>
+          </w:p>
+        </w:tc>
       </w:tr>
       <w:tr>
         <w:tc>
           <w:tcPr>
-            <w:tcW w:type="dxa" w:w="5102"/>
+            <w:tcW w:type="dxa" w:w="3118"/>
           </w:tcPr>
           <w:p>
             <w:r/>
@@ -733,7 +2429,7 @@
         </w:tc>
         <w:tc>
           <w:tcPr>
-            <w:tcW w:type="dxa" w:w="3402"/>
+            <w:tcW w:type="dxa" w:w="3118"/>
           </w:tcPr>
           <w:p>
             <w:r/>
@@ -741,7 +2437,21 @@
               <w:rPr>
                 <w:sz w:val="18"/>
               </w:rPr>
-              <w:t>≥ 30% par rapport à une livraison au coup par coup</w:t>
+              <w:t>≥ 30% vs. livraison au coup par coup</w:t>
+            </w:r>
+          </w:p>
+        </w:tc>
+        <w:tc>
+          <w:tcPr>
+            <w:tcW w:type="dxa" w:w="2551"/>
+          </w:tcPr>
+          <w:p>
+            <w:r/>
+            <w:r>
+              <w:rPr>
+                <w:sz w:val="18"/>
+              </w:rPr>
+              <w:t>Carnet de bord des livraisons</w:t>
             </w:r>
           </w:p>
         </w:tc>
@@ -749,7 +2459,51 @@
       <w:tr>
         <w:tc>
           <w:tcPr>
-            <w:tcW w:type="dxa" w:w="5102"/>
+            <w:tcW w:type="dxa" w:w="3118"/>
+          </w:tcPr>
+          <w:p>
+            <w:r/>
+            <w:r>
+              <w:rPr>
+                <w:sz w:val="18"/>
+              </w:rPr>
+              <w:t>Consommations d'eau / électricité de chantier</w:t>
+            </w:r>
+          </w:p>
+        </w:tc>
+        <w:tc>
+          <w:tcPr>
+            <w:tcW w:type="dxa" w:w="3118"/>
+          </w:tcPr>
+          <w:p>
+            <w:r/>
+            <w:r>
+              <w:rPr>
+                <w:sz w:val="18"/>
+              </w:rPr>
+              <w:t>≤ 0,5 m³ d'eau / &lt; 150 kWh sur 45 jours</w:t>
+            </w:r>
+          </w:p>
+        </w:tc>
+        <w:tc>
+          <w:tcPr>
+            <w:tcW w:type="dxa" w:w="2551"/>
+          </w:tcPr>
+          <w:p>
+            <w:r/>
+            <w:r>
+              <w:rPr>
+                <w:sz w:val="18"/>
+              </w:rPr>
+              <w:t>Relevés hebdomadaires et mensuels</w:t>
+            </w:r>
+          </w:p>
+        </w:tc>
+      </w:tr>
+      <w:tr>
+        <w:tc>
+          <w:tcPr>
+            <w:tcW w:type="dxa" w:w="3118"/>
           </w:tcPr>
           <w:p>
             <w:r/>
@@ -763,7 +2517,7 @@
         </w:tc>
         <w:tc>
           <w:tcPr>
-            <w:tcW w:type="dxa" w:w="3402"/>
+            <w:tcW w:type="dxa" w:w="3118"/>
           </w:tcPr>
           <w:p>
             <w:r/>
@@ -772,6 +2526,57 @@
                 <w:sz w:val="18"/>
               </w:rPr>
               <w:t>0 sur la durée du chantier</w:t>
+            </w:r>
+          </w:p>
+        </w:tc>
+        <w:tc>
+          <w:tcPr>
+            <w:tcW w:type="dxa" w:w="2551"/>
+          </w:tcPr>
+          <w:p>
+            <w:r/>
+            <w:r>
+              <w:rPr>
+                <w:sz w:val="18"/>
+              </w:rPr>
+              <w:t>Compte rendu de réunion de chantier hebdomadaire</w:t>
+            </w:r>
+          </w:p>
+        </w:tc>
+      </w:tr>
+    </w:tbl>
+    <w:p/>
+    <w:tbl>
+      <w:tblPr>
+        <w:tblStyle w:val="TableGrid"/>
+        <w:tblW w:type="auto" w:w="0"/>
+        <w:tblLook w:firstColumn="1" w:firstRow="1" w:lastColumn="0" w:lastRow="0" w:noHBand="0" w:noVBand="1" w:val="04A0"/>
+      </w:tblPr>
+      <w:tblGrid>
+        <w:gridCol w:w="10200"/>
+      </w:tblGrid>
+      <w:tr>
+        <w:tc>
+          <w:tcPr>
+            <w:tcW w:type="dxa" w:w="10200"/>
+            <w:shd w:val="clear" w:color="auto" w:fill="EAF1FA"/>
+          </w:tcPr>
+          <w:p>
+            <w:r/>
+            <w:r>
+              <w:rPr>
+                <w:b/>
+                <w:color w:val="2E74B5"/>
+                <w:sz w:val="19"/>
+              </w:rPr>
+              <w:t xml:space="preserve">Engagement France Décoration — </w:t>
+            </w:r>
+            <w:r>
+              <w:rPr>
+                <w:color w:val="1F3A5F"/>
+                <w:sz w:val="19"/>
+              </w:rPr>
+              <w:t>Taux de valorisation des déchets ≥ 82%, 100% de produits A+, et 0 incident environnemental sur la durée du chantier, avec bilan chiffré remis à réception (cf. chapitre 6, § 6.3.6).</w:t>
             </w:r>
           </w:p>
         </w:tc>
@@ -785,7 +2590,7 @@
           <w:i/>
           <w:sz w:val="21"/>
         </w:rPr>
-        <w:t>L'ensemble de ces engagements fait l'objet d'un suivi contradictoire avec la Maîtrise d'Œuvre tout au long du chantier et d'un bilan chiffré remis à réception (cf. chapitre 6, § 6.3.6), garantissant à l'AP-HP une entière transparence sur leur tenue effective.</w:t>
+        <w:t>L'ensemble de ces six engagements fait l'objet d'un suivi contradictoire avec la Maîtrise d'Œuvre tout au long du chantier — via les réunions hebdomadaires (délais, hospitalier, qualité, réactivité, effectifs) et le tableau de bord environnemental (§ 7.6) — et d'un bilan chiffré global remis à réception, garantissant à l'AP-HP une entière transparence sur leur tenue effective.</w:t>
       </w:r>
     </w:p>
     <w:p/>
@@ -796,7 +2601,7 @@
           <w:color w:val="595959"/>
           <w:sz w:val="17"/>
         </w:rPr>
-        <w:t>Chapitre de synthèse récapitulant les engagements pris par France Décoration dans les chapitres 1 à 6 du présent mémoire technique — Lot 3, marché 26 RMB 41 TVX.</w:t>
+        <w:t>Chapitre de synthèse récapitulant, sous forme d'engagements chiffrés et vérifiables, les dispositions détaillées dans les chapitres 1 à 6 du présent mémoire technique — Lot 3, marché 26 RMB 41 TVX.</w:t>
       </w:r>
     </w:p>
     <w:sectPr>

</xml_diff>